<commit_message>
update ux/ui and fix
</commit_message>
<xml_diff>
--- a/ve-uc.docx
+++ b/ve-uc.docx
@@ -14,93 +14,20 @@
           <w:b/>
           <w:bCs/>
         </w:rPr>
-        <w:t xml:space="preserve">UC1.x - Quản </w:t>
-      </w:r>
-      <w:proofErr w:type="spellStart"/>
+        <w:t xml:space="preserve">UC1.x - Quản lý tài khoản và </w:t>
+      </w:r>
       <w:r>
         <w:rPr>
           <w:b/>
           <w:bCs/>
         </w:rPr>
-        <w:t>lý</w:t>
-      </w:r>
-      <w:proofErr w:type="spellEnd"/>
+        <w:t>Phân quyền</w:t>
+      </w:r>
       <w:r>
         <w:rPr>
           <w:b/>
           <w:bCs/>
         </w:rPr>
-        <w:t xml:space="preserve"> </w:t>
-      </w:r>
-      <w:proofErr w:type="spellStart"/>
-      <w:r>
-        <w:rPr>
-          <w:b/>
-          <w:bCs/>
-        </w:rPr>
-        <w:t>tài</w:t>
-      </w:r>
-      <w:proofErr w:type="spellEnd"/>
-      <w:r>
-        <w:rPr>
-          <w:b/>
-          <w:bCs/>
-        </w:rPr>
-        <w:t xml:space="preserve"> </w:t>
-      </w:r>
-      <w:proofErr w:type="spellStart"/>
-      <w:r>
-        <w:rPr>
-          <w:b/>
-          <w:bCs/>
-        </w:rPr>
-        <w:t>khoản</w:t>
-      </w:r>
-      <w:proofErr w:type="spellEnd"/>
-      <w:r>
-        <w:rPr>
-          <w:b/>
-          <w:bCs/>
-        </w:rPr>
-        <w:t xml:space="preserve"> </w:t>
-      </w:r>
-      <w:proofErr w:type="spellStart"/>
-      <w:r>
-        <w:rPr>
-          <w:b/>
-          <w:bCs/>
-        </w:rPr>
-        <w:t>và</w:t>
-      </w:r>
-      <w:proofErr w:type="spellEnd"/>
-      <w:r>
-        <w:rPr>
-          <w:b/>
-          <w:bCs/>
-        </w:rPr>
-        <w:t xml:space="preserve"> </w:t>
-      </w:r>
-      <w:proofErr w:type="spellStart"/>
-      <w:r>
-        <w:rPr>
-          <w:b/>
-          <w:bCs/>
-        </w:rPr>
-        <w:t>người</w:t>
-      </w:r>
-      <w:proofErr w:type="spellEnd"/>
-      <w:r>
-        <w:rPr>
-          <w:b/>
-          <w:bCs/>
-        </w:rPr>
-        <w:t xml:space="preserve"> dùng</w:t>
-      </w:r>
-      <w:r>
-        <w:rPr>
-          <w:b/>
-          <w:bCs/>
-        </w:rPr>
         <w:t xml:space="preserve">    </w:t>
       </w:r>
     </w:p>
@@ -109,11 +36,14 @@
         <w:t xml:space="preserve">                       </w:t>
       </w:r>
       <w:r>
+        <w:rPr>
+          <w:noProof/>
+        </w:rPr>
         <w:drawing>
-          <wp:inline distT="0" distB="0" distL="0" distR="0" wp14:anchorId="49A51C56" wp14:editId="5E3CF239">
-            <wp:extent cx="3321221" cy="7283824"/>
-            <wp:effectExtent l="0" t="0" r="0" b="0"/>
-            <wp:docPr id="8618810" name="Picture 1"/>
+          <wp:inline distT="0" distB="0" distL="0" distR="0" wp14:anchorId="193C021B" wp14:editId="4731B28B">
+            <wp:extent cx="5943600" cy="5194935"/>
+            <wp:effectExtent l="0" t="0" r="0" b="5715"/>
+            <wp:docPr id="1014061569" name="Picture 1"/>
             <wp:cNvGraphicFramePr>
               <a:graphicFrameLocks xmlns:a="http://schemas.openxmlformats.org/drawingml/2006/main" noChangeAspect="1"/>
             </wp:cNvGraphicFramePr>
@@ -121,7 +51,7 @@
               <a:graphicData uri="http://schemas.openxmlformats.org/drawingml/2006/picture">
                 <pic:pic xmlns:pic="http://schemas.openxmlformats.org/drawingml/2006/picture">
                   <pic:nvPicPr>
-                    <pic:cNvPr id="8618810" name=""/>
+                    <pic:cNvPr id="1014061569" name=""/>
                     <pic:cNvPicPr/>
                   </pic:nvPicPr>
                   <pic:blipFill>
@@ -133,7 +63,7 @@
                   <pic:spPr>
                     <a:xfrm>
                       <a:off x="0" y="0"/>
-                      <a:ext cx="3321221" cy="7283824"/>
+                      <a:ext cx="5943600" cy="5194935"/>
                     </a:xfrm>
                     <a:prstGeom prst="rect">
                       <a:avLst/>
@@ -146,7 +76,11 @@
         </w:drawing>
       </w:r>
     </w:p>
-    <w:p/>
+    <w:p>
+      <w:r>
+        <w:t>Bỏ đăng kí tài khoản</w:t>
+      </w:r>
+    </w:p>
     <w:p>
       <w:pPr>
         <w:rPr>
@@ -154,99 +88,103 @@
           <w:bCs/>
         </w:rPr>
       </w:pPr>
-      <w:r>
+    </w:p>
+    <w:p>
+      <w:pPr>
         <w:rPr>
           <w:b/>
           <w:bCs/>
         </w:rPr>
-        <w:lastRenderedPageBreak/>
-        <w:t xml:space="preserve">UC2.x - Quản </w:t>
-      </w:r>
-      <w:proofErr w:type="spellStart"/>
-      <w:r>
+      </w:pPr>
+    </w:p>
+    <w:p>
+      <w:pPr>
         <w:rPr>
           <w:b/>
           <w:bCs/>
         </w:rPr>
-        <w:t>lý</w:t>
-      </w:r>
-      <w:proofErr w:type="spellEnd"/>
-      <w:r>
+      </w:pPr>
+    </w:p>
+    <w:p>
+      <w:pPr>
         <w:rPr>
           <w:b/>
           <w:bCs/>
         </w:rPr>
-        <w:t xml:space="preserve"> </w:t>
-      </w:r>
-      <w:proofErr w:type="spellStart"/>
-      <w:r>
+      </w:pPr>
+    </w:p>
+    <w:p>
+      <w:pPr>
         <w:rPr>
           <w:b/>
           <w:bCs/>
         </w:rPr>
-        <w:t>tài</w:t>
-      </w:r>
-      <w:proofErr w:type="spellEnd"/>
-      <w:r>
+      </w:pPr>
+    </w:p>
+    <w:p>
+      <w:pPr>
         <w:rPr>
           <w:b/>
           <w:bCs/>
         </w:rPr>
-        <w:t xml:space="preserve"> </w:t>
-      </w:r>
-      <w:proofErr w:type="spellStart"/>
-      <w:r>
+      </w:pPr>
+    </w:p>
+    <w:p>
+      <w:pPr>
         <w:rPr>
           <w:b/>
           <w:bCs/>
         </w:rPr>
-        <w:t>liệu</w:t>
-      </w:r>
-      <w:proofErr w:type="spellEnd"/>
-      <w:r>
+      </w:pPr>
+    </w:p>
+    <w:p>
+      <w:pPr>
         <w:rPr>
           <w:b/>
           <w:bCs/>
         </w:rPr>
-        <w:t xml:space="preserve"> </w:t>
-      </w:r>
-      <w:proofErr w:type="spellStart"/>
-      <w:r>
+      </w:pPr>
+    </w:p>
+    <w:p>
+      <w:pPr>
         <w:rPr>
           <w:b/>
           <w:bCs/>
         </w:rPr>
-        <w:t>thư</w:t>
-      </w:r>
-      <w:proofErr w:type="spellEnd"/>
-      <w:r>
+      </w:pPr>
+    </w:p>
+    <w:p>
+      <w:pPr>
         <w:rPr>
           <w:b/>
           <w:bCs/>
         </w:rPr>
-        <w:t xml:space="preserve"> </w:t>
-      </w:r>
-      <w:proofErr w:type="spellStart"/>
+      </w:pPr>
       <w:r>
         <w:rPr>
           <w:b/>
           <w:bCs/>
         </w:rPr>
-        <w:t>viện</w:t>
-      </w:r>
-      <w:proofErr w:type="spellEnd"/>
+        <w:t>UC2.x - Quản lý tài liệu thư viện</w:t>
+      </w:r>
     </w:p>
     <w:p/>
     <w:p>
       <w:r>
         <w:t xml:space="preserve">                                  </w:t>
       </w:r>
-      <w:r>
+    </w:p>
+    <w:p/>
+    <w:p>
+      <w:r>
+        <w:rPr>
+          <w:noProof/>
+        </w:rPr>
         <w:drawing>
-          <wp:inline distT="0" distB="0" distL="0" distR="0" wp14:anchorId="3B9067A0" wp14:editId="2DE42770">
-            <wp:extent cx="2673487" cy="6845652"/>
+          <wp:inline distT="0" distB="0" distL="0" distR="0" wp14:anchorId="55F7F428" wp14:editId="73C7F470">
+            <wp:extent cx="5911850" cy="2781300"/>
             <wp:effectExtent l="0" t="0" r="0" b="0"/>
-            <wp:docPr id="648015920" name="Picture 1"/>
+            <wp:docPr id="1983093427" name="Picture 2"/>
             <wp:cNvGraphicFramePr>
               <a:graphicFrameLocks xmlns:a="http://schemas.openxmlformats.org/drawingml/2006/main" noChangeAspect="1"/>
             </wp:cNvGraphicFramePr>
@@ -254,23 +192,36 @@
               <a:graphicData uri="http://schemas.openxmlformats.org/drawingml/2006/picture">
                 <pic:pic xmlns:pic="http://schemas.openxmlformats.org/drawingml/2006/picture">
                   <pic:nvPicPr>
-                    <pic:cNvPr id="648015920" name=""/>
-                    <pic:cNvPicPr/>
+                    <pic:cNvPr id="0" name="Picture 2"/>
+                    <pic:cNvPicPr>
+                      <a:picLocks noChangeAspect="1" noChangeArrowheads="1"/>
+                    </pic:cNvPicPr>
                   </pic:nvPicPr>
                   <pic:blipFill>
-                    <a:blip r:embed="rId5"/>
+                    <a:blip r:embed="rId5">
+                      <a:extLst>
+                        <a:ext uri="{28A0092B-C50C-407E-A947-70E740481C1C}">
+                          <a14:useLocalDpi xmlns:a14="http://schemas.microsoft.com/office/drawing/2010/main" val="0"/>
+                        </a:ext>
+                      </a:extLst>
+                    </a:blip>
+                    <a:srcRect/>
                     <a:stretch>
                       <a:fillRect/>
                     </a:stretch>
                   </pic:blipFill>
-                  <pic:spPr>
+                  <pic:spPr bwMode="auto">
                     <a:xfrm>
                       <a:off x="0" y="0"/>
-                      <a:ext cx="2673487" cy="6845652"/>
+                      <a:ext cx="5911850" cy="2781300"/>
                     </a:xfrm>
                     <a:prstGeom prst="rect">
                       <a:avLst/>
                     </a:prstGeom>
+                    <a:noFill/>
+                    <a:ln>
+                      <a:noFill/>
+                    </a:ln>
                   </pic:spPr>
                 </pic:pic>
               </a:graphicData>
@@ -280,53 +231,67 @@
       </w:r>
     </w:p>
     <w:p/>
+    <w:p>
+      <w:r>
+        <w:t xml:space="preserve">Them  2.1  </w:t>
+      </w:r>
+      <w:r>
+        <w:t>loại tài liệu, chuyên ngành, năm xuất bản.</w:t>
+      </w:r>
+    </w:p>
+    <w:p>
+      <w:r>
+        <w:t>lệch tên uc2.2</w:t>
+      </w:r>
+      <w:r>
+        <w:t xml:space="preserve"> Cập nhật hoặc xóa tài liệu</w:t>
+      </w:r>
+      <w:r>
+        <w:t xml:space="preserve"> </w:t>
+      </w:r>
+    </w:p>
+    <w:p>
+      <w:pPr>
+        <w:rPr>
+          <w:lang w:val="vi-VN"/>
+        </w:rPr>
+      </w:pPr>
+      <w:r>
+        <w:t>đánh số cho uc2.3 quản lý sv mượn sách theo ngành</w:t>
+      </w:r>
+    </w:p>
+    <w:p/>
+    <w:p/>
+    <w:p/>
+    <w:p/>
+    <w:p/>
     <w:p/>
     <w:p>
       <w:r>
         <w:lastRenderedPageBreak/>
-        <w:t xml:space="preserve">UC3.x – Quản </w:t>
-      </w:r>
-      <w:proofErr w:type="spellStart"/>
-      <w:r>
-        <w:t>lý</w:t>
-      </w:r>
-      <w:proofErr w:type="spellEnd"/>
-      <w:r>
-        <w:t xml:space="preserve"> </w:t>
-      </w:r>
-      <w:proofErr w:type="spellStart"/>
-      <w:r>
-        <w:t>tài</w:t>
-      </w:r>
-      <w:proofErr w:type="spellEnd"/>
-      <w:r>
-        <w:t xml:space="preserve"> </w:t>
-      </w:r>
-      <w:proofErr w:type="spellStart"/>
-      <w:r>
-        <w:t>nguyên</w:t>
-      </w:r>
-      <w:proofErr w:type="spellEnd"/>
-      <w:r>
-        <w:t xml:space="preserve"> </w:t>
-      </w:r>
-      <w:proofErr w:type="spellStart"/>
-      <w:r>
-        <w:t>số</w:t>
-      </w:r>
-      <w:proofErr w:type="spellEnd"/>
-    </w:p>
-    <w:p/>
-    <w:p>
-      <w:r>
-        <w:t xml:space="preserve">                                 </w:t>
-      </w:r>
-      <w:r>
+        <w:t>UC</w:t>
+      </w:r>
+      <w:r>
+        <w:t>3</w:t>
+      </w:r>
+      <w:r>
+        <w:t>.x – Quản lý tìm kiếm và tra cứu tài liệu</w:t>
+      </w:r>
+    </w:p>
+    <w:p/>
+    <w:p>
+      <w:r>
+        <w:t xml:space="preserve">                     </w:t>
+      </w:r>
+      <w:r>
+        <w:rPr>
+          <w:noProof/>
+        </w:rPr>
         <w:drawing>
-          <wp:inline distT="0" distB="0" distL="0" distR="0" wp14:anchorId="488D0C4E" wp14:editId="661DF289">
-            <wp:extent cx="2730640" cy="6502734"/>
+          <wp:inline distT="0" distB="0" distL="0" distR="0" wp14:anchorId="4B0E6AD2" wp14:editId="5DD1B943">
+            <wp:extent cx="5930900" cy="3244850"/>
             <wp:effectExtent l="0" t="0" r="0" b="0"/>
-            <wp:docPr id="219397421" name="Picture 1"/>
+            <wp:docPr id="471993505" name="Picture 3"/>
             <wp:cNvGraphicFramePr>
               <a:graphicFrameLocks xmlns:a="http://schemas.openxmlformats.org/drawingml/2006/main" noChangeAspect="1"/>
             </wp:cNvGraphicFramePr>
@@ -334,23 +299,36 @@
               <a:graphicData uri="http://schemas.openxmlformats.org/drawingml/2006/picture">
                 <pic:pic xmlns:pic="http://schemas.openxmlformats.org/drawingml/2006/picture">
                   <pic:nvPicPr>
-                    <pic:cNvPr id="219397421" name=""/>
-                    <pic:cNvPicPr/>
+                    <pic:cNvPr id="0" name="Picture 3"/>
+                    <pic:cNvPicPr>
+                      <a:picLocks noChangeAspect="1" noChangeArrowheads="1"/>
+                    </pic:cNvPicPr>
                   </pic:nvPicPr>
                   <pic:blipFill>
-                    <a:blip r:embed="rId6"/>
+                    <a:blip r:embed="rId6">
+                      <a:extLst>
+                        <a:ext uri="{28A0092B-C50C-407E-A947-70E740481C1C}">
+                          <a14:useLocalDpi xmlns:a14="http://schemas.microsoft.com/office/drawing/2010/main" val="0"/>
+                        </a:ext>
+                      </a:extLst>
+                    </a:blip>
+                    <a:srcRect/>
                     <a:stretch>
                       <a:fillRect/>
                     </a:stretch>
                   </pic:blipFill>
-                  <pic:spPr>
+                  <pic:spPr bwMode="auto">
                     <a:xfrm>
                       <a:off x="0" y="0"/>
-                      <a:ext cx="2730640" cy="6502734"/>
+                      <a:ext cx="5930900" cy="3244850"/>
                     </a:xfrm>
                     <a:prstGeom prst="rect">
                       <a:avLst/>
                     </a:prstGeom>
+                    <a:noFill/>
+                    <a:ln>
+                      <a:noFill/>
+                    </a:ln>
                   </pic:spPr>
                 </pic:pic>
               </a:graphicData>
@@ -360,86 +338,57 @@
       </w:r>
     </w:p>
     <w:p/>
+    <w:p>
+      <w:r>
+        <w:t>Them actor thủ thư</w:t>
+      </w:r>
+      <w:r>
+        <w:t>, đánh số uc</w:t>
+      </w:r>
+    </w:p>
+    <w:p/>
+    <w:p/>
+    <w:p/>
+    <w:p/>
+    <w:p/>
+    <w:p/>
+    <w:p/>
+    <w:p/>
+    <w:p/>
     <w:p/>
     <w:p/>
     <w:p>
       <w:r>
         <w:lastRenderedPageBreak/>
-        <w:t xml:space="preserve">UC4.x – Quản </w:t>
-      </w:r>
-      <w:proofErr w:type="spellStart"/>
-      <w:r>
-        <w:t>lý</w:t>
-      </w:r>
-      <w:proofErr w:type="spellEnd"/>
-      <w:r>
-        <w:t xml:space="preserve"> </w:t>
-      </w:r>
-      <w:proofErr w:type="spellStart"/>
-      <w:r>
-        <w:t>tìm</w:t>
-      </w:r>
-      <w:proofErr w:type="spellEnd"/>
-      <w:r>
-        <w:t xml:space="preserve"> </w:t>
-      </w:r>
-      <w:proofErr w:type="spellStart"/>
-      <w:r>
-        <w:t>kiếm</w:t>
-      </w:r>
-      <w:proofErr w:type="spellEnd"/>
-      <w:r>
-        <w:t xml:space="preserve"> </w:t>
-      </w:r>
-      <w:proofErr w:type="spellStart"/>
-      <w:r>
-        <w:t>và</w:t>
-      </w:r>
-      <w:proofErr w:type="spellEnd"/>
-      <w:r>
-        <w:t xml:space="preserve"> </w:t>
-      </w:r>
-      <w:proofErr w:type="spellStart"/>
-      <w:r>
-        <w:t>tra</w:t>
-      </w:r>
-      <w:proofErr w:type="spellEnd"/>
-      <w:r>
-        <w:t xml:space="preserve"> </w:t>
-      </w:r>
-      <w:proofErr w:type="spellStart"/>
-      <w:r>
-        <w:t>cứu</w:t>
-      </w:r>
-      <w:proofErr w:type="spellEnd"/>
-      <w:r>
-        <w:t xml:space="preserve"> </w:t>
-      </w:r>
-      <w:proofErr w:type="spellStart"/>
-      <w:r>
-        <w:t>tài</w:t>
-      </w:r>
-      <w:proofErr w:type="spellEnd"/>
-      <w:r>
-        <w:t xml:space="preserve"> </w:t>
-      </w:r>
-      <w:proofErr w:type="spellStart"/>
-      <w:r>
-        <w:t>liệu</w:t>
-      </w:r>
-      <w:proofErr w:type="spellEnd"/>
-    </w:p>
-    <w:p/>
-    <w:p>
-      <w:r>
-        <w:t xml:space="preserve">                     </w:t>
-      </w:r>
-      <w:r>
+        <w:t>UC</w:t>
+      </w:r>
+      <w:r>
+        <w:t>4</w:t>
+      </w:r>
+      <w:r>
+        <w:t>.x – Quản lý mượn và trả sách</w:t>
+      </w:r>
+      <w:r>
+        <w:t xml:space="preserve"> , </w:t>
+      </w:r>
+      <w:r>
+        <w:t>Quản lý đặt trước tài liệu</w:t>
+      </w:r>
+    </w:p>
+    <w:p/>
+    <w:p>
+      <w:r>
+        <w:t xml:space="preserve">       </w:t>
+      </w:r>
+      <w:r>
+        <w:rPr>
+          <w:noProof/>
+        </w:rPr>
         <w:drawing>
-          <wp:inline distT="0" distB="0" distL="0" distR="0" wp14:anchorId="743C0226" wp14:editId="3D2B4F03">
-            <wp:extent cx="3238666" cy="6940907"/>
-            <wp:effectExtent l="0" t="0" r="0" b="0"/>
-            <wp:docPr id="1506171235" name="Picture 1"/>
+          <wp:inline distT="0" distB="0" distL="0" distR="0" wp14:anchorId="5765F776" wp14:editId="25FDBED0">
+            <wp:extent cx="5931535" cy="2875280"/>
+            <wp:effectExtent l="0" t="0" r="0" b="1270"/>
+            <wp:docPr id="165999246" name="Picture 4"/>
             <wp:cNvGraphicFramePr>
               <a:graphicFrameLocks xmlns:a="http://schemas.openxmlformats.org/drawingml/2006/main" noChangeAspect="1"/>
             </wp:cNvGraphicFramePr>
@@ -447,23 +396,36 @@
               <a:graphicData uri="http://schemas.openxmlformats.org/drawingml/2006/picture">
                 <pic:pic xmlns:pic="http://schemas.openxmlformats.org/drawingml/2006/picture">
                   <pic:nvPicPr>
-                    <pic:cNvPr id="1506171235" name=""/>
-                    <pic:cNvPicPr/>
+                    <pic:cNvPr id="0" name="Picture 4"/>
+                    <pic:cNvPicPr>
+                      <a:picLocks noChangeAspect="1" noChangeArrowheads="1"/>
+                    </pic:cNvPicPr>
                   </pic:nvPicPr>
                   <pic:blipFill>
-                    <a:blip r:embed="rId7"/>
+                    <a:blip r:embed="rId7">
+                      <a:extLst>
+                        <a:ext uri="{28A0092B-C50C-407E-A947-70E740481C1C}">
+                          <a14:useLocalDpi xmlns:a14="http://schemas.microsoft.com/office/drawing/2010/main" val="0"/>
+                        </a:ext>
+                      </a:extLst>
+                    </a:blip>
+                    <a:srcRect/>
                     <a:stretch>
                       <a:fillRect/>
                     </a:stretch>
                   </pic:blipFill>
-                  <pic:spPr>
+                  <pic:spPr bwMode="auto">
                     <a:xfrm>
                       <a:off x="0" y="0"/>
-                      <a:ext cx="3238666" cy="6940907"/>
+                      <a:ext cx="5931535" cy="2875280"/>
                     </a:xfrm>
                     <a:prstGeom prst="rect">
                       <a:avLst/>
                     </a:prstGeom>
+                    <a:noFill/>
+                    <a:ln>
+                      <a:noFill/>
+                    </a:ln>
                   </pic:spPr>
                 </pic:pic>
               </a:graphicData>
@@ -471,63 +433,75 @@
           </wp:inline>
         </w:drawing>
       </w:r>
-    </w:p>
+      <w:r>
+        <w:t xml:space="preserve">                   </w:t>
+      </w:r>
+    </w:p>
+    <w:p/>
+    <w:p>
+      <w:r>
+        <w:t xml:space="preserve">                             </w:t>
+      </w:r>
+    </w:p>
+    <w:p>
+      <w:r>
+        <w:t>Bỏ sinh  viên -ghi nhận trả sách,  sv – lập phiếu mượn</w:t>
+      </w:r>
+    </w:p>
+    <w:p>
+      <w:r>
+        <w:t>thêm kiểm tra giới hạn số lượng mượn vào lập phiếu mượn</w:t>
+      </w:r>
+    </w:p>
+    <w:p>
+      <w:r>
+        <w:t>ghi nhận trả sách thêm cập nhật trạng thái sách, kiểm tra tình trạng sách</w:t>
+      </w:r>
+    </w:p>
+    <w:p/>
+    <w:p/>
+    <w:p/>
+    <w:p/>
+    <w:p/>
+    <w:p/>
+    <w:p/>
     <w:p/>
     <w:p/>
     <w:p>
       <w:r>
         <w:lastRenderedPageBreak/>
-        <w:t xml:space="preserve">UC5.x – Quản </w:t>
-      </w:r>
-      <w:proofErr w:type="spellStart"/>
-      <w:r>
-        <w:t>lý</w:t>
-      </w:r>
-      <w:proofErr w:type="spellEnd"/>
+        <w:t>UC</w:t>
+      </w:r>
+      <w:r>
+        <w:t>5</w:t>
+      </w:r>
+      <w:r>
+        <w:t>.x – Quản lý xử phạt vi phạm thư viện</w:t>
+      </w:r>
+      <w:r>
+        <w:t>,</w:t>
+      </w:r>
       <w:r>
         <w:t xml:space="preserve"> </w:t>
       </w:r>
-      <w:proofErr w:type="spellStart"/>
-      <w:r>
-        <w:t>mượn</w:t>
-      </w:r>
-      <w:proofErr w:type="spellEnd"/>
-      <w:r>
-        <w:t xml:space="preserve"> </w:t>
-      </w:r>
-      <w:proofErr w:type="spellStart"/>
-      <w:r>
-        <w:t>và</w:t>
-      </w:r>
-      <w:proofErr w:type="spellEnd"/>
-      <w:r>
-        <w:t xml:space="preserve"> </w:t>
-      </w:r>
-      <w:proofErr w:type="spellStart"/>
-      <w:r>
-        <w:t>trả</w:t>
-      </w:r>
-      <w:proofErr w:type="spellEnd"/>
-      <w:r>
-        <w:t xml:space="preserve"> </w:t>
-      </w:r>
-      <w:proofErr w:type="spellStart"/>
-      <w:r>
-        <w:t>sách</w:t>
-      </w:r>
-      <w:proofErr w:type="spellEnd"/>
-    </w:p>
-    <w:p/>
-    <w:p>
-      <w:r>
-        <w:t xml:space="preserve">                              </w:t>
-      </w:r>
-      <w:r>
+      <w:r>
+        <w:t>Quản lý phòng</w:t>
+      </w:r>
+    </w:p>
+    <w:p/>
+    <w:p>
+      <w:r>
+        <w:t xml:space="preserve">                          </w:t>
+      </w:r>
+      <w:r>
+        <w:rPr>
+          <w:noProof/>
+        </w:rPr>
         <w:drawing>
-          <wp:inline distT="0" distB="0" distL="0" distR="0" wp14:anchorId="369196C3" wp14:editId="0A518D76">
-            <wp:extent cx="2838596" cy="7582290"/>
-            <wp:effectExtent l="0" t="0" r="0" b="0"/>
-            <wp:docPr id="1754533799" name="Picture 1"/>
+          <wp:inline distT="0" distB="0" distL="0" distR="0" wp14:anchorId="76C30936" wp14:editId="7254873F">
+            <wp:extent cx="5943600" cy="2893695"/>
+            <wp:effectExtent l="0" t="0" r="0" b="1905"/>
+            <wp:docPr id="1561920426" name="Picture 5"/>
             <wp:cNvGraphicFramePr>
               <a:graphicFrameLocks xmlns:a="http://schemas.openxmlformats.org/drawingml/2006/main" noChangeAspect="1"/>
             </wp:cNvGraphicFramePr>
@@ -535,23 +509,36 @@
               <a:graphicData uri="http://schemas.openxmlformats.org/drawingml/2006/picture">
                 <pic:pic xmlns:pic="http://schemas.openxmlformats.org/drawingml/2006/picture">
                   <pic:nvPicPr>
-                    <pic:cNvPr id="1754533799" name=""/>
-                    <pic:cNvPicPr/>
+                    <pic:cNvPr id="0" name="Picture 5"/>
+                    <pic:cNvPicPr>
+                      <a:picLocks noChangeAspect="1" noChangeArrowheads="1"/>
+                    </pic:cNvPicPr>
                   </pic:nvPicPr>
                   <pic:blipFill>
-                    <a:blip r:embed="rId8"/>
+                    <a:blip r:embed="rId8">
+                      <a:extLst>
+                        <a:ext uri="{28A0092B-C50C-407E-A947-70E740481C1C}">
+                          <a14:useLocalDpi xmlns:a14="http://schemas.microsoft.com/office/drawing/2010/main" val="0"/>
+                        </a:ext>
+                      </a:extLst>
+                    </a:blip>
+                    <a:srcRect/>
                     <a:stretch>
                       <a:fillRect/>
                     </a:stretch>
                   </pic:blipFill>
-                  <pic:spPr>
+                  <pic:spPr bwMode="auto">
                     <a:xfrm>
                       <a:off x="0" y="0"/>
-                      <a:ext cx="2838596" cy="7582290"/>
+                      <a:ext cx="5943600" cy="2893695"/>
                     </a:xfrm>
                     <a:prstGeom prst="rect">
                       <a:avLst/>
                     </a:prstGeom>
+                    <a:noFill/>
+                    <a:ln>
+                      <a:noFill/>
+                    </a:ln>
                   </pic:spPr>
                 </pic:pic>
               </a:graphicData>
@@ -560,60 +547,67 @@
         </w:drawing>
       </w:r>
     </w:p>
-    <w:p>
-      <w:r>
-        <w:lastRenderedPageBreak/>
-        <w:t xml:space="preserve">UC6.x – Quản </w:t>
-      </w:r>
-      <w:proofErr w:type="spellStart"/>
-      <w:r>
-        <w:t>lý</w:t>
-      </w:r>
-      <w:proofErr w:type="spellEnd"/>
-      <w:r>
-        <w:t xml:space="preserve"> </w:t>
-      </w:r>
-      <w:proofErr w:type="spellStart"/>
-      <w:r>
-        <w:t>đặt</w:t>
-      </w:r>
-      <w:proofErr w:type="spellEnd"/>
-      <w:r>
-        <w:t xml:space="preserve"> </w:t>
-      </w:r>
-      <w:proofErr w:type="spellStart"/>
-      <w:r>
-        <w:t>trước</w:t>
-      </w:r>
-      <w:proofErr w:type="spellEnd"/>
-      <w:r>
-        <w:t xml:space="preserve"> </w:t>
-      </w:r>
-      <w:proofErr w:type="spellStart"/>
-      <w:r>
-        <w:t>tài</w:t>
-      </w:r>
-      <w:proofErr w:type="spellEnd"/>
-      <w:r>
-        <w:t xml:space="preserve"> </w:t>
-      </w:r>
-      <w:proofErr w:type="spellStart"/>
-      <w:r>
-        <w:t>liệu</w:t>
-      </w:r>
-      <w:proofErr w:type="spellEnd"/>
-    </w:p>
-    <w:p/>
-    <w:p>
-      <w:r>
-        <w:t xml:space="preserve">                             </w:t>
-      </w:r>
-      <w:r>
+    <w:p/>
+    <w:p>
+      <w:r>
+        <w:t>Ghi nhậ</w:t>
+      </w:r>
+      <w:r>
+        <w:t>n mất/ hư hỏng -&gt; ghi nhận tình trạng ----gồm mất, hư hỏng và quá hạn</w:t>
+      </w:r>
+    </w:p>
+    <w:p>
+      <w:r>
+        <w:t>Chuyển thông tin phòng, tính tiền phạt đặt sang màu trắng</w:t>
+      </w:r>
+    </w:p>
+    <w:p/>
+    <w:p>
+      <w:r>
+        <w:t xml:space="preserve">                  </w:t>
+      </w:r>
+    </w:p>
+    <w:p/>
+    <w:p/>
+    <w:p/>
+    <w:p/>
+    <w:p/>
+    <w:p/>
+    <w:p/>
+    <w:p/>
+    <w:p/>
+    <w:p/>
+    <w:p>
+      <w:r>
+        <w:t>UC</w:t>
+      </w:r>
+      <w:r>
+        <w:t>6</w:t>
+      </w:r>
+      <w:r>
+        <w:t>.x – Quản lý thông báo</w:t>
+      </w:r>
+      <w:r>
+        <w:t xml:space="preserve"> , </w:t>
+      </w:r>
+      <w:r>
+        <w:t>Quản lý thống kê và báo cáo</w:t>
+      </w:r>
+    </w:p>
+    <w:p/>
+    <w:p>
+      <w:r>
+        <w:t xml:space="preserve">                     </w:t>
+      </w:r>
+      <w:r>
+        <w:rPr>
+          <w:noProof/>
+        </w:rPr>
         <w:drawing>
-          <wp:inline distT="0" distB="0" distL="0" distR="0" wp14:anchorId="3C231876" wp14:editId="296E4DF8">
-            <wp:extent cx="3130711" cy="5950256"/>
-            <wp:effectExtent l="0" t="0" r="0" b="0"/>
-            <wp:docPr id="215073687" name="Picture 1"/>
+          <wp:inline distT="0" distB="0" distL="0" distR="0" wp14:anchorId="673A9D68" wp14:editId="2959B55A">
+            <wp:extent cx="5943600" cy="2986405"/>
+            <wp:effectExtent l="0" t="0" r="0" b="4445"/>
+            <wp:docPr id="1498844107" name="Picture 6"/>
             <wp:cNvGraphicFramePr>
               <a:graphicFrameLocks xmlns:a="http://schemas.openxmlformats.org/drawingml/2006/main" noChangeAspect="1"/>
             </wp:cNvGraphicFramePr>
@@ -621,23 +615,36 @@
               <a:graphicData uri="http://schemas.openxmlformats.org/drawingml/2006/picture">
                 <pic:pic xmlns:pic="http://schemas.openxmlformats.org/drawingml/2006/picture">
                   <pic:nvPicPr>
-                    <pic:cNvPr id="215073687" name=""/>
-                    <pic:cNvPicPr/>
+                    <pic:cNvPr id="0" name="Picture 6"/>
+                    <pic:cNvPicPr>
+                      <a:picLocks noChangeAspect="1" noChangeArrowheads="1"/>
+                    </pic:cNvPicPr>
                   </pic:nvPicPr>
                   <pic:blipFill>
-                    <a:blip r:embed="rId9"/>
+                    <a:blip r:embed="rId9">
+                      <a:extLst>
+                        <a:ext uri="{28A0092B-C50C-407E-A947-70E740481C1C}">
+                          <a14:useLocalDpi xmlns:a14="http://schemas.microsoft.com/office/drawing/2010/main" val="0"/>
+                        </a:ext>
+                      </a:extLst>
+                    </a:blip>
+                    <a:srcRect/>
                     <a:stretch>
                       <a:fillRect/>
                     </a:stretch>
                   </pic:blipFill>
-                  <pic:spPr>
+                  <pic:spPr bwMode="auto">
                     <a:xfrm>
                       <a:off x="0" y="0"/>
-                      <a:ext cx="3130711" cy="5950256"/>
+                      <a:ext cx="5943600" cy="2986405"/>
                     </a:xfrm>
                     <a:prstGeom prst="rect">
                       <a:avLst/>
                     </a:prstGeom>
+                    <a:noFill/>
+                    <a:ln>
+                      <a:noFill/>
+                    </a:ln>
                   </pic:spPr>
                 </pic:pic>
               </a:graphicData>
@@ -646,73 +653,137 @@
         </w:drawing>
       </w:r>
     </w:p>
-    <w:p/>
-    <w:p/>
-    <w:p/>
-    <w:p/>
-    <w:p/>
-    <w:p>
-      <w:r>
-        <w:lastRenderedPageBreak/>
-        <w:t xml:space="preserve">UC7.x – Quản </w:t>
-      </w:r>
-      <w:proofErr w:type="spellStart"/>
-      <w:r>
-        <w:t>lý</w:t>
-      </w:r>
-      <w:proofErr w:type="spellEnd"/>
+    <w:p>
+      <w:r>
+        <w:rPr>
+          <w:noProof/>
+        </w:rPr>
+        <mc:AlternateContent>
+          <mc:Choice Requires="wpi">
+            <w:drawing>
+              <wp:anchor distT="0" distB="0" distL="114300" distR="114300" simplePos="0" relativeHeight="251672576" behindDoc="0" locked="0" layoutInCell="1" allowOverlap="1" wp14:anchorId="591EE765" wp14:editId="6690F241">
+                <wp:simplePos x="0" y="0"/>
+                <wp:positionH relativeFrom="column">
+                  <wp:posOffset>3842510</wp:posOffset>
+                </wp:positionH>
+                <wp:positionV relativeFrom="paragraph">
+                  <wp:posOffset>1182265</wp:posOffset>
+                </wp:positionV>
+                <wp:extent cx="360" cy="360"/>
+                <wp:effectExtent l="38100" t="38100" r="38100" b="38100"/>
+                <wp:wrapNone/>
+                <wp:docPr id="1238055650" name="Ink 19"/>
+                <wp:cNvGraphicFramePr/>
+                <a:graphic xmlns:a="http://schemas.openxmlformats.org/drawingml/2006/main">
+                  <a:graphicData uri="http://schemas.microsoft.com/office/word/2010/wordprocessingInk">
+                    <w14:contentPart bwMode="auto" r:id="rId10">
+                      <w14:nvContentPartPr>
+                        <w14:cNvContentPartPr/>
+                      </w14:nvContentPartPr>
+                      <w14:xfrm>
+                        <a:off x="0" y="0"/>
+                        <a:ext cx="360" cy="360"/>
+                      </w14:xfrm>
+                    </w14:contentPart>
+                  </a:graphicData>
+                </a:graphic>
+                <wp14:sizeRelH relativeFrom="margin">
+                  <wp14:pctWidth>0</wp14:pctWidth>
+                </wp14:sizeRelH>
+                <wp14:sizeRelV relativeFrom="margin">
+                  <wp14:pctHeight>0</wp14:pctHeight>
+                </wp14:sizeRelV>
+              </wp:anchor>
+            </w:drawing>
+          </mc:Choice>
+          <mc:Fallback>
+            <w:pict>
+              <v:shapetype w14:anchorId="00ACA27B" id="_x0000_t75" coordsize="21600,21600" o:spt="75" o:preferrelative="t" path="m@4@5l@4@11@9@11@9@5xe" filled="f" stroked="f">
+                <v:stroke joinstyle="miter"/>
+                <v:formulas>
+                  <v:f eqn="if lineDrawn pixelLineWidth 0"/>
+                  <v:f eqn="sum @0 1 0"/>
+                  <v:f eqn="sum 0 0 @1"/>
+                  <v:f eqn="prod @2 1 2"/>
+                  <v:f eqn="prod @3 21600 pixelWidth"/>
+                  <v:f eqn="prod @3 21600 pixelHeight"/>
+                  <v:f eqn="sum @0 0 1"/>
+                  <v:f eqn="prod @6 1 2"/>
+                  <v:f eqn="prod @7 21600 pixelWidth"/>
+                  <v:f eqn="sum @8 21600 0"/>
+                  <v:f eqn="prod @7 21600 pixelHeight"/>
+                  <v:f eqn="sum @10 21600 0"/>
+                </v:formulas>
+                <v:path o:extrusionok="f" gradientshapeok="t" o:connecttype="rect"/>
+                <o:lock v:ext="edit" aspectratio="t"/>
+              </v:shapetype>
+              <v:shape id="Ink 19" o:spid="_x0000_s1026" type="#_x0000_t75" style="position:absolute;margin-left:302.05pt;margin-top:92.6pt;width:1.05pt;height:1.05pt;z-index:251672576;visibility:visible;mso-wrap-style:square;mso-width-percent:0;mso-height-percent:0;mso-wrap-distance-left:9pt;mso-wrap-distance-top:0;mso-wrap-distance-right:9pt;mso-wrap-distance-bottom:0;mso-position-horizontal:absolute;mso-position-horizontal-relative:text;mso-position-vertical:absolute;mso-position-vertical-relative:text;mso-width-percent:0;mso-height-percent:0;mso-width-relative:margin;mso-height-relative:margin" o:gfxdata="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">
+                <v:imagedata r:id="rId11" o:title=""/>
+              </v:shape>
+            </w:pict>
+          </mc:Fallback>
+        </mc:AlternateContent>
+      </w:r>
+    </w:p>
+    <w:p>
+      <w:r>
+        <w:t>Bỏ quản lí thư viện</w:t>
+      </w:r>
+    </w:p>
+    <w:p>
+      <w:r>
+        <w:t>Đổi xuất báo cáo, gửi thông báo thành trắng</w:t>
+      </w:r>
+      <w:r>
+        <w:t>, cho xuống cấp 3</w:t>
+      </w:r>
+    </w:p>
+    <w:p/>
+    <w:p>
       <w:r>
         <w:t xml:space="preserve"> </w:t>
       </w:r>
-      <w:proofErr w:type="spellStart"/>
-      <w:r>
-        <w:t>xử</w:t>
-      </w:r>
-      <w:proofErr w:type="spellEnd"/>
-      <w:r>
-        <w:t xml:space="preserve"> </w:t>
-      </w:r>
-      <w:proofErr w:type="spellStart"/>
-      <w:r>
-        <w:t>phạt</w:t>
-      </w:r>
-      <w:proofErr w:type="spellEnd"/>
-      <w:r>
-        <w:t xml:space="preserve"> vi </w:t>
-      </w:r>
-      <w:proofErr w:type="spellStart"/>
-      <w:r>
-        <w:t>phạm</w:t>
-      </w:r>
-      <w:proofErr w:type="spellEnd"/>
-      <w:r>
-        <w:t xml:space="preserve"> </w:t>
-      </w:r>
-      <w:proofErr w:type="spellStart"/>
-      <w:r>
-        <w:t>thư</w:t>
-      </w:r>
-      <w:proofErr w:type="spellEnd"/>
-      <w:r>
-        <w:t xml:space="preserve"> </w:t>
-      </w:r>
-      <w:proofErr w:type="spellStart"/>
-      <w:r>
-        <w:t>viện</w:t>
-      </w:r>
-      <w:proofErr w:type="spellEnd"/>
-    </w:p>
-    <w:p/>
-    <w:p>
-      <w:r>
-        <w:t xml:space="preserve">                          </w:t>
-      </w:r>
-      <w:r>
+      <w:r>
+        <w:tab/>
+      </w:r>
+    </w:p>
+    <w:p/>
+    <w:p/>
+    <w:p/>
+    <w:p/>
+    <w:p/>
+    <w:p/>
+    <w:p/>
+    <w:p/>
+    <w:p/>
+    <w:p>
+      <w:r>
+        <w:t>UC</w:t>
+      </w:r>
+      <w:r>
+        <w:t>7</w:t>
+      </w:r>
+      <w:r>
+        <w:t>.x – Quản trị hệ thống</w:t>
+      </w:r>
+    </w:p>
+    <w:p/>
+    <w:p>
+      <w:r>
+        <w:t xml:space="preserve">                           </w:t>
+      </w:r>
+    </w:p>
+    <w:p/>
+    <w:p>
+      <w:r>
+        <w:rPr>
+          <w:noProof/>
+        </w:rPr>
         <w:drawing>
-          <wp:inline distT="0" distB="0" distL="0" distR="0" wp14:anchorId="33E3D796" wp14:editId="46D26D4F">
-            <wp:extent cx="2978303" cy="5893103"/>
+          <wp:inline distT="0" distB="0" distL="0" distR="0" wp14:anchorId="44E05FD7" wp14:editId="2B168680">
+            <wp:extent cx="5932170" cy="2899410"/>
             <wp:effectExtent l="0" t="0" r="0" b="0"/>
-            <wp:docPr id="306298783" name="Picture 1"/>
+            <wp:docPr id="1391216067" name="Picture 7"/>
             <wp:cNvGraphicFramePr>
               <a:graphicFrameLocks xmlns:a="http://schemas.openxmlformats.org/drawingml/2006/main" noChangeAspect="1"/>
             </wp:cNvGraphicFramePr>
@@ -720,376 +791,36 @@
               <a:graphicData uri="http://schemas.openxmlformats.org/drawingml/2006/picture">
                 <pic:pic xmlns:pic="http://schemas.openxmlformats.org/drawingml/2006/picture">
                   <pic:nvPicPr>
-                    <pic:cNvPr id="306298783" name=""/>
-                    <pic:cNvPicPr/>
+                    <pic:cNvPr id="0" name="Picture 7"/>
+                    <pic:cNvPicPr>
+                      <a:picLocks noChangeAspect="1" noChangeArrowheads="1"/>
+                    </pic:cNvPicPr>
                   </pic:nvPicPr>
                   <pic:blipFill>
-                    <a:blip r:embed="rId10"/>
+                    <a:blip r:embed="rId12">
+                      <a:extLst>
+                        <a:ext uri="{28A0092B-C50C-407E-A947-70E740481C1C}">
+                          <a14:useLocalDpi xmlns:a14="http://schemas.microsoft.com/office/drawing/2010/main" val="0"/>
+                        </a:ext>
+                      </a:extLst>
+                    </a:blip>
+                    <a:srcRect/>
                     <a:stretch>
                       <a:fillRect/>
                     </a:stretch>
                   </pic:blipFill>
-                  <pic:spPr>
+                  <pic:spPr bwMode="auto">
                     <a:xfrm>
                       <a:off x="0" y="0"/>
-                      <a:ext cx="2978303" cy="5893103"/>
+                      <a:ext cx="5932170" cy="2899410"/>
                     </a:xfrm>
                     <a:prstGeom prst="rect">
                       <a:avLst/>
                     </a:prstGeom>
-                  </pic:spPr>
-                </pic:pic>
-              </a:graphicData>
-            </a:graphic>
-          </wp:inline>
-        </w:drawing>
-      </w:r>
-    </w:p>
-    <w:p/>
-    <w:p/>
-    <w:p/>
-    <w:p/>
-    <w:p/>
-    <w:p>
-      <w:r>
-        <w:lastRenderedPageBreak/>
-        <w:t xml:space="preserve">UC8.x – Quản </w:t>
-      </w:r>
-      <w:proofErr w:type="spellStart"/>
-      <w:r>
-        <w:t>lý</w:t>
-      </w:r>
-      <w:proofErr w:type="spellEnd"/>
-      <w:r>
-        <w:t xml:space="preserve"> </w:t>
-      </w:r>
-      <w:proofErr w:type="spellStart"/>
-      <w:r>
-        <w:t>phòng</w:t>
-      </w:r>
-      <w:proofErr w:type="spellEnd"/>
-      <w:r>
-        <w:t xml:space="preserve"> </w:t>
-      </w:r>
-      <w:proofErr w:type="spellStart"/>
-      <w:r>
-        <w:t>đọc</w:t>
-      </w:r>
-      <w:proofErr w:type="spellEnd"/>
-      <w:r>
-        <w:t xml:space="preserve"> </w:t>
-      </w:r>
-      <w:proofErr w:type="spellStart"/>
-      <w:r>
-        <w:t>và</w:t>
-      </w:r>
-      <w:proofErr w:type="spellEnd"/>
-      <w:r>
-        <w:t xml:space="preserve"> </w:t>
-      </w:r>
-      <w:proofErr w:type="spellStart"/>
-      <w:r>
-        <w:t>phòng</w:t>
-      </w:r>
-      <w:proofErr w:type="spellEnd"/>
-      <w:r>
-        <w:t xml:space="preserve"> </w:t>
-      </w:r>
-      <w:proofErr w:type="spellStart"/>
-      <w:r>
-        <w:t>học</w:t>
-      </w:r>
-      <w:proofErr w:type="spellEnd"/>
-      <w:r>
-        <w:t xml:space="preserve"> </w:t>
-      </w:r>
-      <w:proofErr w:type="spellStart"/>
-      <w:r>
-        <w:t>nhóm</w:t>
-      </w:r>
-      <w:proofErr w:type="spellEnd"/>
-    </w:p>
-    <w:p/>
-    <w:p>
-      <w:r>
-        <w:t xml:space="preserve">                    </w:t>
-      </w:r>
-      <w:r>
-        <w:drawing>
-          <wp:inline distT="0" distB="0" distL="0" distR="0" wp14:anchorId="0EEFD3E7" wp14:editId="21A0F5A0">
-            <wp:extent cx="3416476" cy="5607338"/>
-            <wp:effectExtent l="0" t="0" r="0" b="0"/>
-            <wp:docPr id="1232035990" name="Picture 1"/>
-            <wp:cNvGraphicFramePr>
-              <a:graphicFrameLocks xmlns:a="http://schemas.openxmlformats.org/drawingml/2006/main" noChangeAspect="1"/>
-            </wp:cNvGraphicFramePr>
-            <a:graphic xmlns:a="http://schemas.openxmlformats.org/drawingml/2006/main">
-              <a:graphicData uri="http://schemas.openxmlformats.org/drawingml/2006/picture">
-                <pic:pic xmlns:pic="http://schemas.openxmlformats.org/drawingml/2006/picture">
-                  <pic:nvPicPr>
-                    <pic:cNvPr id="1232035990" name=""/>
-                    <pic:cNvPicPr/>
-                  </pic:nvPicPr>
-                  <pic:blipFill>
-                    <a:blip r:embed="rId11"/>
-                    <a:stretch>
-                      <a:fillRect/>
-                    </a:stretch>
-                  </pic:blipFill>
-                  <pic:spPr>
-                    <a:xfrm>
-                      <a:off x="0" y="0"/>
-                      <a:ext cx="3416476" cy="5607338"/>
-                    </a:xfrm>
-                    <a:prstGeom prst="rect">
-                      <a:avLst/>
-                    </a:prstGeom>
-                  </pic:spPr>
-                </pic:pic>
-              </a:graphicData>
-            </a:graphic>
-          </wp:inline>
-        </w:drawing>
-      </w:r>
-    </w:p>
-    <w:p/>
-    <w:p/>
-    <w:p/>
-    <w:p/>
-    <w:p/>
-    <w:p/>
-    <w:p>
-      <w:r>
-        <w:lastRenderedPageBreak/>
-        <w:t xml:space="preserve">UC9.x – Quản </w:t>
-      </w:r>
-      <w:proofErr w:type="spellStart"/>
-      <w:r>
-        <w:t>lý</w:t>
-      </w:r>
-      <w:proofErr w:type="spellEnd"/>
-      <w:r>
-        <w:t xml:space="preserve"> </w:t>
-      </w:r>
-      <w:proofErr w:type="spellStart"/>
-      <w:r>
-        <w:t>thông</w:t>
-      </w:r>
-      <w:proofErr w:type="spellEnd"/>
-      <w:r>
-        <w:t xml:space="preserve"> </w:t>
-      </w:r>
-      <w:proofErr w:type="spellStart"/>
-      <w:r>
-        <w:t>báo</w:t>
-      </w:r>
-      <w:proofErr w:type="spellEnd"/>
-    </w:p>
-    <w:p/>
-    <w:p>
-      <w:r>
-        <w:t xml:space="preserve">                             </w:t>
-      </w:r>
-      <w:r>
-        <w:drawing>
-          <wp:inline distT="0" distB="0" distL="0" distR="0" wp14:anchorId="67C83B64" wp14:editId="079B4C24">
-            <wp:extent cx="2692538" cy="5740695"/>
-            <wp:effectExtent l="0" t="0" r="0" b="0"/>
-            <wp:docPr id="1427528890" name="Picture 1"/>
-            <wp:cNvGraphicFramePr>
-              <a:graphicFrameLocks xmlns:a="http://schemas.openxmlformats.org/drawingml/2006/main" noChangeAspect="1"/>
-            </wp:cNvGraphicFramePr>
-            <a:graphic xmlns:a="http://schemas.openxmlformats.org/drawingml/2006/main">
-              <a:graphicData uri="http://schemas.openxmlformats.org/drawingml/2006/picture">
-                <pic:pic xmlns:pic="http://schemas.openxmlformats.org/drawingml/2006/picture">
-                  <pic:nvPicPr>
-                    <pic:cNvPr id="1427528890" name=""/>
-                    <pic:cNvPicPr/>
-                  </pic:nvPicPr>
-                  <pic:blipFill>
-                    <a:blip r:embed="rId12"/>
-                    <a:stretch>
-                      <a:fillRect/>
-                    </a:stretch>
-                  </pic:blipFill>
-                  <pic:spPr>
-                    <a:xfrm>
-                      <a:off x="0" y="0"/>
-                      <a:ext cx="2692538" cy="5740695"/>
-                    </a:xfrm>
-                    <a:prstGeom prst="rect">
-                      <a:avLst/>
-                    </a:prstGeom>
-                  </pic:spPr>
-                </pic:pic>
-              </a:graphicData>
-            </a:graphic>
-          </wp:inline>
-        </w:drawing>
-      </w:r>
-    </w:p>
-    <w:p/>
-    <w:p/>
-    <w:p/>
-    <w:p/>
-    <w:p/>
-    <w:p>
-      <w:r>
-        <w:lastRenderedPageBreak/>
-        <w:t xml:space="preserve">UC10.x – Quản </w:t>
-      </w:r>
-      <w:proofErr w:type="spellStart"/>
-      <w:r>
-        <w:t>lý</w:t>
-      </w:r>
-      <w:proofErr w:type="spellEnd"/>
-      <w:r>
-        <w:t xml:space="preserve"> </w:t>
-      </w:r>
-      <w:proofErr w:type="spellStart"/>
-      <w:r>
-        <w:t>thống</w:t>
-      </w:r>
-      <w:proofErr w:type="spellEnd"/>
-      <w:r>
-        <w:t xml:space="preserve"> </w:t>
-      </w:r>
-      <w:proofErr w:type="spellStart"/>
-      <w:r>
-        <w:t>kê</w:t>
-      </w:r>
-      <w:proofErr w:type="spellEnd"/>
-      <w:r>
-        <w:t xml:space="preserve"> </w:t>
-      </w:r>
-      <w:proofErr w:type="spellStart"/>
-      <w:r>
-        <w:t>và</w:t>
-      </w:r>
-      <w:proofErr w:type="spellEnd"/>
-      <w:r>
-        <w:t xml:space="preserve"> </w:t>
-      </w:r>
-      <w:proofErr w:type="spellStart"/>
-      <w:r>
-        <w:t>báo</w:t>
-      </w:r>
-      <w:proofErr w:type="spellEnd"/>
-      <w:r>
-        <w:t xml:space="preserve"> </w:t>
-      </w:r>
-      <w:proofErr w:type="spellStart"/>
-      <w:r>
-        <w:t>cáo</w:t>
-      </w:r>
-      <w:proofErr w:type="spellEnd"/>
-    </w:p>
-    <w:p/>
-    <w:p>
-      <w:r>
-        <w:t xml:space="preserve">                     </w:t>
-      </w:r>
-      <w:r>
-        <w:drawing>
-          <wp:inline distT="0" distB="0" distL="0" distR="0" wp14:anchorId="27355586" wp14:editId="441EB512">
-            <wp:extent cx="3187864" cy="7086964"/>
-            <wp:effectExtent l="0" t="0" r="0" b="0"/>
-            <wp:docPr id="610115061" name="Picture 1"/>
-            <wp:cNvGraphicFramePr>
-              <a:graphicFrameLocks xmlns:a="http://schemas.openxmlformats.org/drawingml/2006/main" noChangeAspect="1"/>
-            </wp:cNvGraphicFramePr>
-            <a:graphic xmlns:a="http://schemas.openxmlformats.org/drawingml/2006/main">
-              <a:graphicData uri="http://schemas.openxmlformats.org/drawingml/2006/picture">
-                <pic:pic xmlns:pic="http://schemas.openxmlformats.org/drawingml/2006/picture">
-                  <pic:nvPicPr>
-                    <pic:cNvPr id="610115061" name=""/>
-                    <pic:cNvPicPr/>
-                  </pic:nvPicPr>
-                  <pic:blipFill>
-                    <a:blip r:embed="rId13"/>
-                    <a:stretch>
-                      <a:fillRect/>
-                    </a:stretch>
-                  </pic:blipFill>
-                  <pic:spPr>
-                    <a:xfrm>
-                      <a:off x="0" y="0"/>
-                      <a:ext cx="3187864" cy="7086964"/>
-                    </a:xfrm>
-                    <a:prstGeom prst="rect">
-                      <a:avLst/>
-                    </a:prstGeom>
-                  </pic:spPr>
-                </pic:pic>
-              </a:graphicData>
-            </a:graphic>
-          </wp:inline>
-        </w:drawing>
-      </w:r>
-    </w:p>
-    <w:p/>
-    <w:p>
-      <w:r>
-        <w:lastRenderedPageBreak/>
-        <w:t xml:space="preserve">UC11.x – Quản </w:t>
-      </w:r>
-      <w:proofErr w:type="spellStart"/>
-      <w:r>
-        <w:t>trị</w:t>
-      </w:r>
-      <w:proofErr w:type="spellEnd"/>
-      <w:r>
-        <w:t xml:space="preserve"> </w:t>
-      </w:r>
-      <w:proofErr w:type="spellStart"/>
-      <w:r>
-        <w:t>hệ</w:t>
-      </w:r>
-      <w:proofErr w:type="spellEnd"/>
-      <w:r>
-        <w:t xml:space="preserve"> </w:t>
-      </w:r>
-      <w:proofErr w:type="spellStart"/>
-      <w:r>
-        <w:t>thống</w:t>
-      </w:r>
-      <w:proofErr w:type="spellEnd"/>
-    </w:p>
-    <w:p/>
-    <w:p>
-      <w:r>
-        <w:t xml:space="preserve">                           </w:t>
-      </w:r>
-      <w:r>
-        <w:drawing>
-          <wp:inline distT="0" distB="0" distL="0" distR="0" wp14:anchorId="7F424F58" wp14:editId="14C3C90A">
-            <wp:extent cx="2901950" cy="7581900"/>
-            <wp:effectExtent l="0" t="0" r="0" b="0"/>
-            <wp:docPr id="1123534573" name="Picture 1"/>
-            <wp:cNvGraphicFramePr>
-              <a:graphicFrameLocks xmlns:a="http://schemas.openxmlformats.org/drawingml/2006/main" noChangeAspect="1"/>
-            </wp:cNvGraphicFramePr>
-            <a:graphic xmlns:a="http://schemas.openxmlformats.org/drawingml/2006/main">
-              <a:graphicData uri="http://schemas.openxmlformats.org/drawingml/2006/picture">
-                <pic:pic xmlns:pic="http://schemas.openxmlformats.org/drawingml/2006/picture">
-                  <pic:nvPicPr>
-                    <pic:cNvPr id="1123534573" name=""/>
-                    <pic:cNvPicPr/>
-                  </pic:nvPicPr>
-                  <pic:blipFill>
-                    <a:blip r:embed="rId14"/>
-                    <a:stretch>
-                      <a:fillRect/>
-                    </a:stretch>
-                  </pic:blipFill>
-                  <pic:spPr>
-                    <a:xfrm>
-                      <a:off x="0" y="0"/>
-                      <a:ext cx="2902099" cy="7582289"/>
-                    </a:xfrm>
-                    <a:prstGeom prst="rect">
-                      <a:avLst/>
-                    </a:prstGeom>
+                    <a:noFill/>
+                    <a:ln>
+                      <a:noFill/>
+                    </a:ln>
                   </pic:spPr>
                 </pic:pic>
               </a:graphicData>
@@ -1710,6 +1441,7 @@
   <w:style w:type="character" w:default="1" w:styleId="DefaultParagraphFont">
     <w:name w:val="Default Paragraph Font"/>
     <w:uiPriority w:val="1"/>
+    <w:semiHidden/>
     <w:unhideWhenUsed/>
   </w:style>
   <w:style w:type="table" w:default="1" w:styleId="TableNormal">
@@ -2023,6 +1755,34 @@
     </w:rPr>
   </w:style>
 </w:styles>
+</file>
+
+<file path=word/ink/ink1.xml><?xml version="1.0" encoding="utf-8"?>
+<inkml:ink xmlns:inkml="http://www.w3.org/2003/InkML">
+  <inkml:definitions>
+    <inkml:context xml:id="ctx0">
+      <inkml:inkSource xml:id="inkSrc0">
+        <inkml:traceFormat>
+          <inkml:channel name="X" type="integer" min="-2.14748E9" max="2.14748E9" units="cm"/>
+          <inkml:channel name="Y" type="integer" min="-2.14748E9" max="2.14748E9" units="cm"/>
+          <inkml:channel name="F" type="integer" max="32767" units="dev"/>
+        </inkml:traceFormat>
+        <inkml:channelProperties>
+          <inkml:channelProperty channel="X" name="resolution" value="1000" units="1/cm"/>
+          <inkml:channelProperty channel="Y" name="resolution" value="1000" units="1/cm"/>
+          <inkml:channelProperty channel="F" name="resolution" value="0" units="1/dev"/>
+        </inkml:channelProperties>
+      </inkml:inkSource>
+      <inkml:timestamp xml:id="ts0" timeString="2026-07-21T16:06:31.831"/>
+    </inkml:context>
+    <inkml:brush xml:id="br0">
+      <inkml:brushProperty name="width" value="0.035" units="cm"/>
+      <inkml:brushProperty name="height" value="0.035" units="cm"/>
+      <inkml:brushProperty name="color" value="#E71224"/>
+    </inkml:brush>
+  </inkml:definitions>
+  <inkml:trace contextRef="#ctx0" brushRef="#br0">750 514 24575,'0'0'-8191</inkml:trace>
+</inkml:ink>
 </file>
 
 <file path=word/theme/theme1.xml><?xml version="1.0" encoding="utf-8"?>

</xml_diff>